<commit_message>
docs: finalize project documentation
</commit_message>
<xml_diff>
--- a/docs/Event_Management_System_SAD.docx
+++ b/docs/Event_Management_System_SAD.docx
@@ -51,10 +51,7 @@
         <w:rPr/>
       </w:pPr>
       <w:r>
-        <w:rPr>
-          <w:rtl w:val="0"/>
-        </w:rPr>
-        <w:t xml:space="preserve">Version: 1.4</w:t>
+        <w:t>Version: 1.5</w:t>
       </w:r>
     </w:p>
     <w:p>
@@ -115,16 +112,7 @@
         <w:rPr/>
       </w:pPr>
       <w:r>
-        <w:rPr>
-          <w:rFonts w:ascii="Calibri" w:cs="Calibri" w:eastAsia="Calibri" w:hAnsi="Calibri"/>
-          <w:rtl w:val="0"/>
-        </w:rPr>
-        <w:t xml:space="preserve">Status: Draft</w:t>
-      </w:r>
-      <w:r>
-        <w:rPr>
-          <w:rtl w:val="0"/>
-        </w:rPr>
+        <w:t>Status: Draft — implementation baseline reviewed 29 October 2026</w:t>
       </w:r>
     </w:p>
     <w:p>
@@ -686,6 +674,48 @@
           </w:p>
         </w:tc>
       </w:tr>
+      <w:tr>
+        <w:tc>
+          <w:tcPr>
+            <w:tcW w:type="dxa" w:w="1800"/>
+          </w:tcPr>
+          <w:p>
+            <w:r>
+              <w:t>1.5</w:t>
+            </w:r>
+          </w:p>
+        </w:tc>
+        <w:tc>
+          <w:tcPr>
+            <w:tcW w:type="dxa" w:w="1500"/>
+          </w:tcPr>
+          <w:p>
+            <w:r>
+              <w:t>29-10-2026</w:t>
+            </w:r>
+          </w:p>
+        </w:tc>
+        <w:tc>
+          <w:tcPr>
+            <w:tcW w:type="dxa" w:w="2500"/>
+          </w:tcPr>
+          <w:p>
+            <w:r>
+              <w:t>Harshith J</w:t>
+            </w:r>
+          </w:p>
+        </w:tc>
+        <w:tc>
+          <w:tcPr>
+            <w:tcW w:type="dxa" w:w="3200"/>
+          </w:tcPr>
+          <w:p>
+            <w:r>
+              <w:t>Replaced target-state diagrams/API examples with as-built architecture, routes and explicit future-scope status.</w:t>
+            </w:r>
+          </w:p>
+        </w:tc>
+      </w:tr>
     </w:tbl>
     <w:p>
       <w:pPr>
@@ -951,16 +981,7 @@
         <w:rPr/>
       </w:pPr>
       <w:r>
-        <w:rPr>
-          <w:rFonts w:ascii="Calibri" w:cs="Calibri" w:eastAsia="Calibri" w:hAnsi="Calibri"/>
-          <w:rtl w:val="0"/>
-        </w:rPr>
-        <w:t xml:space="preserve">This document specifies the software architecture and design of the Event Management System (EMS): a web platform through which Organizers create and manage events and teh Attendees discover, register for, and pay for them.</w:t>
-      </w:r>
-      <w:r>
-        <w:rPr>
-          <w:rtl w:val="0"/>
-        </w:rPr>
+        <w:t>This document specifies the architecture and design of the Event Management System as implemented in the repository snapshot reviewed on 29 October 2026. The current application is a React/Vite client, Node.js/Express API, Sequelize data layer and SQLite database with User and Event models. Registration, payment, notifications, QR/check-in, feedback and reporting modules shown in earlier target-state drafts are not present in this baseline.</w:t>
       </w:r>
     </w:p>
     <w:p>
@@ -993,16 +1014,7 @@
         <w:rPr/>
       </w:pPr>
       <w:r>
-        <w:rPr>
-          <w:rFonts w:ascii="Calibri" w:cs="Calibri" w:eastAsia="Calibri" w:hAnsi="Calibri"/>
-          <w:rtl w:val="0"/>
-        </w:rPr>
-        <w:t xml:space="preserve">Covers the system's major services namely authentication, event management, registration/waitlisting, payments, notifications, QR check-in, and reporting their component structure, interactions, chosen architecture pattern, security architecture, API design, and key design decisions. Excluding third-party payment gateway and email/SMS provider internals, which are consumed as external services.</w:t>
-      </w:r>
-      <w:r>
-        <w:rPr>
-          <w:rtl w:val="0"/>
-        </w:rPr>
+        <w:t>This revision documents the delivered architecture for account registration/verification/login, JWT-based authorization, event creation/edit/publish/cancel, and public event discovery. Planned services for event registration/waitlisting, payments, notifications, QR check-in and reporting are listed as future scope rather than depicted as running components.</w:t>
       </w:r>
     </w:p>
     <w:p>
@@ -1203,28 +1215,7 @@
         <w:rPr/>
       </w:pPr>
       <w:r>
-        <w:rPr>
-          <w:rFonts w:ascii="Calibri" w:cs="Calibri" w:eastAsia="Calibri" w:hAnsi="Calibri"/>
-          <w:b w:val="0"/>
-          <w:bCs w:val="0"/>
-          <w:i w:val="0"/>
-          <w:iCs w:val="0"/>
-          <w:smallCaps w:val="0"/>
-          <w:strike w:val="0"/>
-          <w:color w:val="000000"/>
-          <w:sz w:val="20"/>
-          <w:szCs w:val="20"/>
-          <w:u w:val="none"/>
-          <w:shd w:fill="auto" w:val="clear"/>
-          <w:vertAlign w:val="baseline"/>
-          <w:rtl w:val="0"/>
-        </w:rPr>
-        <w:t xml:space="preserve">Software Requirements Specification (SRS) — Event Management System, v1.3</w:t>
-      </w:r>
-      <w:r>
-        <w:rPr>
-          <w:rtl w:val="0"/>
-        </w:rPr>
+        <w:t>Software Requirements Specification (SRS) — Event Management System, v1.5</w:t>
       </w:r>
     </w:p>
     <w:p>
@@ -1377,16 +1368,7 @@
         <w:rPr/>
       </w:pPr>
       <w:r>
-        <w:rPr>
-          <w:rFonts w:ascii="Calibri" w:cs="Calibri" w:eastAsia="Calibri" w:hAnsi="Calibri"/>
-          <w:rtl w:val="0"/>
-        </w:rPr>
-        <w:t xml:space="preserve">Goals: secure handling of user, payment data; reliable registration with no overbooking; a responsive experience for both Organizers and Attendees; maintainable, modular codebase. Constraints which must integrate with third-party payment gateway; must not store raw card data; development timeline bound by academic term schedule.</w:t>
-      </w:r>
-      <w:r>
-        <w:rPr>
-          <w:rtl w:val="0"/>
-        </w:rPr>
+        <w:t>Current goals: protect account data, enforce JWT and server-side role/ownership checks, validate event lifecycle changes, and maintain a modular/testable web application. Constraints: local SQLite is the development store; production TLS, deployment hardening and future registration/payment workflows are not included in this baseline.</w:t>
       </w:r>
     </w:p>
     <w:p>
@@ -1639,7 +1621,7 @@
         <w:rPr/>
         <w:drawing>
           <wp:inline distB="0" distT="0" distL="0" distR="0">
-            <wp:extent cx="5524500" cy="2257425"/>
+            <wp:extent cx="5760720" cy="3776472"/>
             <wp:effectExtent b="0" l="0" r="0" t="0"/>
             <wp:docPr id="1673150246" name="image1.png"/>
             <a:graphic>
@@ -1659,7 +1641,7 @@
                   <pic:spPr>
                     <a:xfrm>
                       <a:off x="0" y="0"/>
-                      <a:ext cx="5524500" cy="2257425"/>
+                      <a:ext cx="5760720" cy="3776472"/>
                     </a:xfrm>
                     <a:prstGeom prst="rect"/>
                     <a:ln/>
@@ -1683,20 +1665,7 @@
         <w:rPr/>
       </w:pPr>
       <w:r>
-        <w:rPr>
-          <w:rFonts w:ascii="Calibri" w:cs="Calibri" w:eastAsia="Calibri" w:hAnsi="Calibri"/>
-          <w:i w:val="1"/>
-          <w:iCs w:val="1"/>
-          <w:sz w:val="19"/>
-          <w:szCs w:val="19"/>
-          <w:rtl w:val="0"/>
-        </w:rPr>
-        <w:t xml:space="preserve">Figure 1 — Component diagram of the Event Management System.</w:t>
-      </w:r>
-      <w:r>
-        <w:rPr>
-          <w:rtl w:val="0"/>
-        </w:rPr>
+        <w:t>Figure 1 — As-built component diagram: React/Vite, Express routes/controllers, JWT middleware, Sequelize User/Event models and SQLite. Planned modules are marked as absent.</w:t>
       </w:r>
     </w:p>
     <w:p>
@@ -1849,20 +1818,8 @@
             </w:tcMar>
           </w:tcPr>
           <w:p>
-            <w:pPr>
-              <w:rPr/>
-            </w:pPr>
-            <w:r>
-              <w:rPr>
-                <w:rFonts w:ascii="Calibri" w:cs="Calibri" w:eastAsia="Calibri" w:hAnsi="Calibri"/>
-                <w:rtl w:val="0"/>
-              </w:rPr>
-              <w:t xml:space="preserve">Renders Organizer, Attendee, and Admin interfaces; calls the backend REST API over HTTPS.</w:t>
-            </w:r>
-            <w:r>
-              <w:rPr>
-                <w:rtl w:val="0"/>
-              </w:rPr>
+            <w:r>
+              <w:t>Implemented: React 18/Vite pages for account access, public event discovery/details and Organizer event management. No Admin dashboard, checkout or check-in UI.</w:t>
             </w:r>
           </w:p>
         </w:tc>
@@ -1899,20 +1856,8 @@
             </w:tcMar>
           </w:tcPr>
           <w:p>
-            <w:pPr>
-              <w:rPr/>
-            </w:pPr>
-            <w:r>
-              <w:rPr>
-                <w:rFonts w:ascii="Calibri" w:cs="Calibri" w:eastAsia="Calibri" w:hAnsi="Calibri"/>
-                <w:rtl w:val="0"/>
-              </w:rPr>
-              <w:t xml:space="preserve">Single entry point for all client requests; handles routing, request validation, and delegates to the domain services below.</w:t>
-            </w:r>
-            <w:r>
-              <w:rPr>
-                <w:rtl w:val="0"/>
-              </w:rPr>
+            <w:r>
+              <w:t>Implemented: Express server mounts /api/health, /api/auth, /api/events and /api/example, JSON parsing, CORS and error handlers.</w:t>
             </w:r>
           </w:p>
         </w:tc>
@@ -1955,20 +1900,8 @@
             </w:tcMar>
           </w:tcPr>
           <w:p>
-            <w:pPr>
-              <w:rPr/>
-            </w:pPr>
-            <w:r>
-              <w:rPr>
-                <w:rFonts w:ascii="Calibri" w:cs="Calibri" w:eastAsia="Calibri" w:hAnsi="Calibri"/>
-                <w:rtl w:val="0"/>
-              </w:rPr>
-              <w:t xml:space="preserve">Handles registration, login, password hashing, session/JWT issuance, and role-based access control (RBAC).</w:t>
-            </w:r>
-            <w:r>
-              <w:rPr>
-                <w:rtl w:val="0"/>
-              </w:rPr>
+            <w:r>
+              <w:t>Implemented: register, verify email, login/JWT, bcrypt hash, login lockout/rate limit and public current-user route. Verification link is logged to console in development.</w:t>
             </w:r>
           </w:p>
         </w:tc>
@@ -2011,20 +1944,8 @@
             </w:tcMar>
           </w:tcPr>
           <w:p>
-            <w:pPr>
-              <w:rPr/>
-            </w:pPr>
-            <w:r>
-              <w:rPr>
-                <w:rFonts w:ascii="Calibri" w:cs="Calibri" w:eastAsia="Calibri" w:hAnsi="Calibri"/>
-                <w:rtl w:val="0"/>
-              </w:rPr>
-              <w:t xml:space="preserve">Handles event creation, editing, publishing, and cancellation by Organizers.</w:t>
-            </w:r>
-            <w:r>
-              <w:rPr>
-                <w:rtl w:val="0"/>
-              </w:rPr>
+            <w:r>
+              <w:t>Implemented in event routes/controller: create, list/search/filter, get details, manage own events, edit, publish, cancel, validation and owner/admin checks.</w:t>
             </w:r>
           </w:p>
         </w:tc>
@@ -2067,20 +1988,8 @@
             </w:tcMar>
           </w:tcPr>
           <w:p>
-            <w:pPr>
-              <w:rPr/>
-            </w:pPr>
-            <w:r>
-              <w:rPr>
-                <w:rFonts w:ascii="Calibri" w:cs="Calibri" w:eastAsia="Calibri" w:hAnsi="Calibri"/>
-                <w:rtl w:val="0"/>
-              </w:rPr>
-              <w:t xml:space="preserve">Manages attendee registrations, capacity checks, and automatic waitlisting.</w:t>
-            </w:r>
-            <w:r>
-              <w:rPr>
-                <w:rtl w:val="0"/>
-              </w:rPr>
+            <w:r>
+              <w:t>Planned/not implemented. No Registration model, event-registration route or waitlist behavior exists in this baseline.</w:t>
             </w:r>
           </w:p>
         </w:tc>
@@ -2123,20 +2032,8 @@
             </w:tcMar>
           </w:tcPr>
           <w:p>
-            <w:pPr>
-              <w:rPr/>
-            </w:pPr>
-            <w:r>
-              <w:rPr>
-                <w:rFonts w:ascii="Calibri" w:cs="Calibri" w:eastAsia="Calibri" w:hAnsi="Calibri"/>
-                <w:rtl w:val="0"/>
-              </w:rPr>
-              <w:t xml:space="preserve">Initiates and confirms payments through the external payment gateway and issues refunds.</w:t>
-            </w:r>
-            <w:r>
-              <w:rPr>
-                <w:rtl w:val="0"/>
-              </w:rPr>
+            <w:r>
+              <w:t>Planned/not implemented. No payment route/model, gateway integration or refund flow exists.</w:t>
             </w:r>
           </w:p>
         </w:tc>
@@ -2179,20 +2076,8 @@
             </w:tcMar>
           </w:tcPr>
           <w:p>
-            <w:pPr>
-              <w:rPr/>
-            </w:pPr>
-            <w:r>
-              <w:rPr>
-                <w:rFonts w:ascii="Calibri" w:cs="Calibri" w:eastAsia="Calibri" w:hAnsi="Calibri"/>
-                <w:rtl w:val="0"/>
-              </w:rPr>
-              <w:t xml:space="preserve">Sends confirmation, reminder, and change-notification emails/SMS via an external provider.</w:t>
-            </w:r>
-            <w:r>
-              <w:rPr>
-                <w:rtl w:val="0"/>
-              </w:rPr>
+            <w:r>
+              <w:t>Planned/not implemented for email/SMS event messages. The auth controller prints a development verification link to server console; it does not send an email.</w:t>
             </w:r>
           </w:p>
         </w:tc>
@@ -2235,20 +2120,8 @@
             </w:tcMar>
           </w:tcPr>
           <w:p>
-            <w:pPr>
-              <w:rPr/>
-            </w:pPr>
-            <w:r>
-              <w:rPr>
-                <w:rFonts w:ascii="Calibri" w:cs="Calibri" w:eastAsia="Calibri" w:hAnsi="Calibri"/>
-                <w:rtl w:val="0"/>
-              </w:rPr>
-              <w:t xml:space="preserve">Generates per-registration QR codes and validates scans at the event to mark attendance.</w:t>
-            </w:r>
-            <w:r>
-              <w:rPr>
-                <w:rtl w:val="0"/>
-              </w:rPr>
+            <w:r>
+              <w:t>Planned/not implemented. No ticket/QR generator or check-in route exists.</w:t>
             </w:r>
           </w:p>
         </w:tc>
@@ -2291,20 +2164,8 @@
             </w:tcMar>
           </w:tcPr>
           <w:p>
-            <w:pPr>
-              <w:rPr/>
-            </w:pPr>
-            <w:r>
-              <w:rPr>
-                <w:rFonts w:ascii="Calibri" w:cs="Calibri" w:eastAsia="Calibri" w:hAnsi="Calibri"/>
-                <w:rtl w:val="0"/>
-              </w:rPr>
-              <w:t xml:space="preserve">Aggregates registration, revenue, and attendance data for Organizer and Admin dashboards.</w:t>
-            </w:r>
-            <w:r>
-              <w:rPr>
-                <w:rtl w:val="0"/>
-              </w:rPr>
+            <w:r>
+              <w:t>Planned/not implemented. ADMIN can manage all events through protected routes, but there is no reporting dashboard or CSV export.</w:t>
             </w:r>
           </w:p>
         </w:tc>
@@ -2347,20 +2208,8 @@
             </w:tcMar>
           </w:tcPr>
           <w:p>
-            <w:pPr>
-              <w:rPr/>
-            </w:pPr>
-            <w:r>
-              <w:rPr>
-                <w:rFonts w:ascii="Calibri" w:cs="Calibri" w:eastAsia="Calibri" w:hAnsi="Calibri"/>
-                <w:rtl w:val="0"/>
-              </w:rPr>
-              <w:t xml:space="preserve">Persistent storage for users, events, registrations, payments, and notification logs.</w:t>
-            </w:r>
-            <w:r>
-              <w:rPr>
-                <w:rtl w:val="0"/>
-              </w:rPr>
+            <w:r>
+              <w:t>Implemented local store is SQLite via Sequelize. Current models: User and Event, with User.hasMany(Event) via organizerId. No production DB provisioning or registration/payment tables.</w:t>
             </w:r>
           </w:p>
         </w:tc>
@@ -2407,16 +2256,7 @@
         <w:rPr/>
       </w:pPr>
       <w:r>
-        <w:rPr>
-          <w:rFonts w:ascii="Calibri" w:cs="Calibri" w:eastAsia="Calibri" w:hAnsi="Calibri"/>
-          <w:rtl w:val="0"/>
-        </w:rPr>
-        <w:t xml:space="preserve">A layered, service-oriented architecture is chosen: a single-page React.js front end communicates with a Node.js/Express API server, which delegates to focused domain services (Auth, Event Management, Registration, Payment, Notification, Check-in, Reporting), all backed by 1 relational database. This keeps each concern independently testable and replaceable without the operational overhead of full microservices (separate deployments, inter-service networking, distributed transactions), which wass considered and rejected as unnecessary at the project's current scale. As a project built in JavaScript (React.js + Node.js) or alternatively Python (Django), the same layered separation applies regardless of final language choice- Django's app-per-domain structure maps directly onto the same service boundaries.</w:t>
-      </w:r>
-      <w:r>
-        <w:rPr>
-          <w:rtl w:val="0"/>
-        </w:rPr>
+        <w:t>The delivered implementation is a layered monolithic application: a React/Vite single-page frontend calls one Node.js/Express server, which mounts authentication and event routers, delegates to controllers and middleware, and persists User/Event models with Sequelize to SQLite. The code is modular by route/controller/model, but independent domain services (registration, payment, notification, check-in and reporting) have not been implemented or deployed. This is a simpler current architecture than the target service layout in earlier drafts.</w:t>
       </w:r>
     </w:p>
     <w:p>
@@ -2467,28 +2307,7 @@
         <w:rPr/>
       </w:pPr>
       <w:r>
-        <w:rPr>
-          <w:rFonts w:ascii="Calibri" w:cs="Calibri" w:eastAsia="Calibri" w:hAnsi="Calibri"/>
-          <w:b w:val="0"/>
-          <w:bCs w:val="0"/>
-          <w:i w:val="0"/>
-          <w:iCs w:val="0"/>
-          <w:smallCaps w:val="0"/>
-          <w:strike w:val="0"/>
-          <w:color w:val="000000"/>
-          <w:sz w:val="20"/>
-          <w:szCs w:val="20"/>
-          <w:u w:val="none"/>
-          <w:shd w:fill="auto" w:val="clear"/>
-          <w:vertAlign w:val="baseline"/>
-          <w:rtl w:val="0"/>
-        </w:rPr>
-        <w:t xml:space="preserve">Front end: React.js (single-page application), responsive CSS.</w:t>
-      </w:r>
-      <w:r>
-        <w:rPr>
-          <w:rtl w:val="0"/>
-        </w:rPr>
+        <w:t>Front end: React 18, Vite, React Router, Axios API client and CSS.</w:t>
       </w:r>
     </w:p>
     <w:p>
@@ -2515,23 +2334,7 @@
         <w:rPr/>
       </w:pPr>
       <w:r>
-        <w:rPr>
-          <w:rFonts w:ascii="Times New Roman" w:cs="Times New Roman" w:eastAsia="Times New Roman" w:hAnsi="Times New Roman"/>
-          <w:b w:val="0"/>
-          <w:bCs w:val="0"/>
-          <w:i w:val="0"/>
-          <w:iCs w:val="0"/>
-          <w:smallCaps w:val="0"/>
-          <w:strike w:val="0"/>
-          <w:color w:val="000000"/>
-          <w:sz w:val="20"/>
-          <w:szCs w:val="20"/>
-          <w:u w:val="none"/>
-          <w:shd w:fill="auto" w:val="clear"/>
-          <w:vertAlign w:val="baseline"/>
-          <w:rtl w:val="0"/>
-        </w:rPr>
-        <w:t xml:space="preserve">Back end: Node.js + Express, REST API, JWT-based authentication.</w:t>
+        <w:t>Back end: Node.js + Express, JSON REST API, bcrypt password hashing, JWT access tokens and express-rate-limit on login.</w:t>
       </w:r>
     </w:p>
     <w:p>
@@ -2558,28 +2361,7 @@
         <w:rPr/>
       </w:pPr>
       <w:r>
-        <w:rPr>
-          <w:rFonts w:ascii="Calibri" w:cs="Calibri" w:eastAsia="Calibri" w:hAnsi="Calibri"/>
-          <w:b w:val="0"/>
-          <w:bCs w:val="0"/>
-          <w:i w:val="0"/>
-          <w:iCs w:val="0"/>
-          <w:smallCaps w:val="0"/>
-          <w:strike w:val="0"/>
-          <w:color w:val="000000"/>
-          <w:sz w:val="20"/>
-          <w:szCs w:val="20"/>
-          <w:u w:val="none"/>
-          <w:shd w:fill="auto" w:val="clear"/>
-          <w:vertAlign w:val="baseline"/>
-          <w:rtl w:val="0"/>
-        </w:rPr>
-        <w:t xml:space="preserve">Database: PostgreSQL or MySQL (relational, transactional integrity for registration/payment records).</w:t>
-      </w:r>
-      <w:r>
-        <w:rPr>
-          <w:rtl w:val="0"/>
-        </w:rPr>
+        <w:t>Database: SQLite via Sequelize for local development. Only User and Event models are registered in the current server. PostgreSQL/MySQL production setup is not included.</w:t>
       </w:r>
     </w:p>
     <w:p>
@@ -2606,28 +2388,7 @@
         <w:rPr/>
       </w:pPr>
       <w:r>
-        <w:rPr>
-          <w:rFonts w:ascii="Calibri" w:cs="Calibri" w:eastAsia="Calibri" w:hAnsi="Calibri"/>
-          <w:b w:val="0"/>
-          <w:bCs w:val="0"/>
-          <w:i w:val="0"/>
-          <w:iCs w:val="0"/>
-          <w:smallCaps w:val="0"/>
-          <w:strike w:val="0"/>
-          <w:color w:val="000000"/>
-          <w:sz w:val="20"/>
-          <w:szCs w:val="20"/>
-          <w:u w:val="none"/>
-          <w:shd w:fill="auto" w:val="clear"/>
-          <w:vertAlign w:val="baseline"/>
-          <w:rtl w:val="0"/>
-        </w:rPr>
-        <w:t xml:space="preserve">External services: third-party payment gateway (e.g., Razorpay/Stripe-style API); email/SMS provider (e.g., SendGrid/Twilio-style API).</w:t>
-      </w:r>
-      <w:r>
-        <w:rPr>
-          <w:rtl w:val="0"/>
-        </w:rPr>
+        <w:t>External services: none are integrated in the current baseline. Payment gateway and email/SMS provider integrations are future work.</w:t>
       </w:r>
     </w:p>
     <w:p>
@@ -2654,28 +2415,7 @@
         <w:rPr/>
       </w:pPr>
       <w:r>
-        <w:rPr>
-          <w:rFonts w:ascii="Calibri" w:cs="Calibri" w:eastAsia="Calibri" w:hAnsi="Calibri"/>
-          <w:b w:val="0"/>
-          <w:bCs w:val="0"/>
-          <w:i w:val="0"/>
-          <w:iCs w:val="0"/>
-          <w:smallCaps w:val="0"/>
-          <w:strike w:val="0"/>
-          <w:color w:val="000000"/>
-          <w:sz w:val="20"/>
-          <w:szCs w:val="20"/>
-          <w:u w:val="none"/>
-          <w:shd w:fill="auto" w:val="clear"/>
-          <w:vertAlign w:val="baseline"/>
-          <w:rtl w:val="0"/>
-        </w:rPr>
-        <w:t xml:space="preserve">Transport security: TLS/HTTPS for all client-server and server-to-gateway communication.</w:t>
-      </w:r>
-      <w:r>
-        <w:rPr>
-          <w:rtl w:val="0"/>
-        </w:rPr>
+        <w:t>Transport security: the local Express server uses HTTP; production HTTPS/TLS termination must be supplied by deployment infrastructure and is not configured or verified in this repository.</w:t>
       </w:r>
     </w:p>
     <w:p>
@@ -2726,28 +2466,7 @@
         <w:rPr/>
       </w:pPr>
       <w:r>
-        <w:rPr>
-          <w:rFonts w:ascii="Calibri" w:cs="Calibri" w:eastAsia="Calibri" w:hAnsi="Calibri"/>
-          <w:b w:val="0"/>
-          <w:bCs w:val="0"/>
-          <w:i w:val="0"/>
-          <w:iCs w:val="0"/>
-          <w:smallCaps w:val="0"/>
-          <w:strike w:val="0"/>
-          <w:color w:val="000000"/>
-          <w:sz w:val="20"/>
-          <w:szCs w:val="20"/>
-          <w:u w:val="none"/>
-          <w:shd w:fill="auto" w:val="clear"/>
-          <w:vertAlign w:val="baseline"/>
-          <w:rtl w:val="0"/>
-        </w:rPr>
-        <w:t xml:space="preserve">Risk: Registration race condition causing overbooking → Mitigation: database-level transactional capacity checks (row locking) in the Registration Service.</w:t>
-      </w:r>
-      <w:r>
-        <w:rPr>
-          <w:rtl w:val="0"/>
-        </w:rPr>
+        <w:t>Future risk (registration module not implemented): registration race conditions could cause overbooking. No capacity reservation/transaction mitigation can be claimed until the registration model and API are built and tested.</w:t>
       </w:r>
     </w:p>
     <w:p>
@@ -2774,28 +2493,7 @@
         <w:rPr/>
       </w:pPr>
       <w:r>
-        <w:rPr>
-          <w:rFonts w:ascii="Calibri" w:cs="Calibri" w:eastAsia="Calibri" w:hAnsi="Calibri"/>
-          <w:b w:val="0"/>
-          <w:bCs w:val="0"/>
-          <w:i w:val="0"/>
-          <w:iCs w:val="0"/>
-          <w:smallCaps w:val="0"/>
-          <w:strike w:val="0"/>
-          <w:color w:val="000000"/>
-          <w:sz w:val="20"/>
-          <w:szCs w:val="20"/>
-          <w:u w:val="none"/>
-          <w:shd w:fill="auto" w:val="clear"/>
-          <w:vertAlign w:val="baseline"/>
-          <w:rtl w:val="0"/>
-        </w:rPr>
-        <w:t xml:space="preserve">Risk: Payment gateway downtime → Mitigation: asynchronous payment status polling/webhooks with retry, and clear 'pending' states shown to the user.</w:t>
-      </w:r>
-      <w:r>
-        <w:rPr>
-          <w:rtl w:val="0"/>
-        </w:rPr>
+        <w:t>Future risk (payment module not implemented): payment gateway downtime will need explicit pending states, retry handling and reconciliation if a provider is integrated.</w:t>
       </w:r>
     </w:p>
     <w:p>
@@ -2822,28 +2520,7 @@
         <w:rPr/>
       </w:pPr>
       <w:r>
-        <w:rPr>
-          <w:rFonts w:ascii="Calibri" w:cs="Calibri" w:eastAsia="Calibri" w:hAnsi="Calibri"/>
-          <w:b w:val="0"/>
-          <w:bCs w:val="0"/>
-          <w:i w:val="0"/>
-          <w:iCs w:val="0"/>
-          <w:smallCaps w:val="0"/>
-          <w:strike w:val="0"/>
-          <w:color w:val="000000"/>
-          <w:sz w:val="20"/>
-          <w:szCs w:val="20"/>
-          <w:u w:val="none"/>
-          <w:shd w:fill="auto" w:val="clear"/>
-          <w:vertAlign w:val="baseline"/>
-          <w:rtl w:val="0"/>
-        </w:rPr>
-        <w:t xml:space="preserve">Risk: Notification provider rate limits during a reminder burst → Mitigation: queue-based dispatch with backoff instead of synchronous sends.</w:t>
-      </w:r>
-      <w:r>
-        <w:rPr>
-          <w:rtl w:val="0"/>
-        </w:rPr>
+        <w:t>Future risk (notification module not implemented): production notification delivery may need queued dispatch and backoff if an email/SMS provider is integrated.</w:t>
       </w:r>
     </w:p>
     <w:p>
@@ -2876,16 +2553,7 @@
         <w:rPr/>
       </w:pPr>
       <w:r>
-        <w:rPr>
-          <w:rFonts w:ascii="Calibri" w:cs="Calibri" w:eastAsia="Calibri" w:hAnsi="Calibri"/>
-          <w:rtl w:val="0"/>
-        </w:rPr>
-        <w:t xml:space="preserve">The table below maps groups the of SRS functional requirements (REQ-1 through REQ-28) to the architecture component responsible for satisfying them; see the SRS Appendix C for the full per-requirement traceability matrix.</w:t>
-      </w:r>
-      <w:r>
-        <w:rPr>
-          <w:rtl w:val="0"/>
-        </w:rPr>
+        <w:t>The traceability table separates implemented account/event components from planned future components. A named future component in the table is a requirement/placeholder, not a deployed service in this repository snapshot.</w:t>
       </w:r>
     </w:p>
     <w:tbl>
@@ -3069,20 +2737,8 @@
             </w:tcMar>
           </w:tcPr>
           <w:p>
-            <w:pPr>
-              <w:rPr/>
-            </w:pPr>
-            <w:r>
-              <w:rPr>
-                <w:rFonts w:ascii="Calibri" w:cs="Calibri" w:eastAsia="Calibri" w:hAnsi="Calibri"/>
-                <w:rtl w:val="0"/>
-              </w:rPr>
-              <w:t xml:space="preserve">Auth Service</w:t>
-            </w:r>
-            <w:r>
-              <w:rPr>
-                <w:rtl w:val="0"/>
-              </w:rPr>
+            <w:r>
+              <w:t>Auth routes/controller + JWT/RBAC middleware (implemented)</w:t>
             </w:r>
           </w:p>
         </w:tc>
@@ -3150,20 +2806,8 @@
             </w:tcMar>
           </w:tcPr>
           <w:p>
-            <w:pPr>
-              <w:rPr/>
-            </w:pPr>
-            <w:r>
-              <w:rPr>
-                <w:rFonts w:ascii="Calibri" w:cs="Calibri" w:eastAsia="Calibri" w:hAnsi="Calibri"/>
-                <w:rtl w:val="0"/>
-              </w:rPr>
-              <w:t xml:space="preserve">Event Management Service</w:t>
-            </w:r>
-            <w:r>
-              <w:rPr>
-                <w:rtl w:val="0"/>
-              </w:rPr>
+            <w:r>
+              <w:t>Event routes/controller + Event model (implemented)</w:t>
             </w:r>
           </w:p>
         </w:tc>
@@ -3231,20 +2875,8 @@
             </w:tcMar>
           </w:tcPr>
           <w:p>
-            <w:pPr>
-              <w:rPr/>
-            </w:pPr>
-            <w:r>
-              <w:rPr>
-                <w:rFonts w:ascii="Calibri" w:cs="Calibri" w:eastAsia="Calibri" w:hAnsi="Calibri"/>
-                <w:rtl w:val="0"/>
-              </w:rPr>
-              <w:t xml:space="preserve">Event Management Service, Web Client</w:t>
-            </w:r>
-            <w:r>
-              <w:rPr>
-                <w:rtl w:val="0"/>
-              </w:rPr>
+            <w:r>
+              <w:t>Event controller + React event pages (implemented)</w:t>
             </w:r>
           </w:p>
         </w:tc>
@@ -3312,20 +2944,8 @@
             </w:tcMar>
           </w:tcPr>
           <w:p>
-            <w:pPr>
-              <w:rPr/>
-            </w:pPr>
-            <w:r>
-              <w:rPr>
-                <w:rFonts w:ascii="Calibri" w:cs="Calibri" w:eastAsia="Calibri" w:hAnsi="Calibri"/>
-                <w:rtl w:val="0"/>
-              </w:rPr>
-              <w:t xml:space="preserve">Registration &amp; Waitlist Service</w:t>
-            </w:r>
-            <w:r>
-              <w:rPr>
-                <w:rtl w:val="0"/>
-              </w:rPr>
+            <w:r>
+              <w:t>Planned only — named service is not implemented in current baseline</w:t>
             </w:r>
           </w:p>
         </w:tc>
@@ -3393,20 +3013,8 @@
             </w:tcMar>
           </w:tcPr>
           <w:p>
-            <w:pPr>
-              <w:rPr/>
-            </w:pPr>
-            <w:r>
-              <w:rPr>
-                <w:rFonts w:ascii="Calibri" w:cs="Calibri" w:eastAsia="Calibri" w:hAnsi="Calibri"/>
-                <w:rtl w:val="0"/>
-              </w:rPr>
-              <w:t xml:space="preserve">Payment Service</w:t>
-            </w:r>
-            <w:r>
-              <w:rPr>
-                <w:rtl w:val="0"/>
-              </w:rPr>
+            <w:r>
+              <w:t>Planned only — named service is not implemented in current baseline</w:t>
             </w:r>
           </w:p>
         </w:tc>
@@ -3474,20 +3082,8 @@
             </w:tcMar>
           </w:tcPr>
           <w:p>
-            <w:pPr>
-              <w:rPr/>
-            </w:pPr>
-            <w:r>
-              <w:rPr>
-                <w:rFonts w:ascii="Calibri" w:cs="Calibri" w:eastAsia="Calibri" w:hAnsi="Calibri"/>
-                <w:rtl w:val="0"/>
-              </w:rPr>
-              <w:t xml:space="preserve">Notification Service</w:t>
-            </w:r>
-            <w:r>
-              <w:rPr>
-                <w:rtl w:val="0"/>
-              </w:rPr>
+            <w:r>
+              <w:t>Planned only — named service is not implemented in current baseline</w:t>
             </w:r>
           </w:p>
         </w:tc>
@@ -3555,20 +3151,8 @@
             </w:tcMar>
           </w:tcPr>
           <w:p>
-            <w:pPr>
-              <w:rPr/>
-            </w:pPr>
-            <w:r>
-              <w:rPr>
-                <w:rFonts w:ascii="Calibri" w:cs="Calibri" w:eastAsia="Calibri" w:hAnsi="Calibri"/>
-                <w:rtl w:val="0"/>
-              </w:rPr>
-              <w:t xml:space="preserve">QR Check-in Service</w:t>
-            </w:r>
-            <w:r>
-              <w:rPr>
-                <w:rtl w:val="0"/>
-              </w:rPr>
+            <w:r>
+              <w:t>Planned only — named service is not implemented in current baseline</w:t>
             </w:r>
           </w:p>
         </w:tc>
@@ -3636,20 +3220,8 @@
             </w:tcMar>
           </w:tcPr>
           <w:p>
-            <w:pPr>
-              <w:rPr/>
-            </w:pPr>
-            <w:r>
-              <w:rPr>
-                <w:rFonts w:ascii="Calibri" w:cs="Calibri" w:eastAsia="Calibri" w:hAnsi="Calibri"/>
-                <w:rtl w:val="0"/>
-              </w:rPr>
-              <w:t xml:space="preserve">Reporting &amp; Admin Dashboard Service</w:t>
-            </w:r>
-            <w:r>
-              <w:rPr>
-                <w:rtl w:val="0"/>
-              </w:rPr>
+            <w:r>
+              <w:t>Planned only — named service is not implemented in current baseline</w:t>
             </w:r>
           </w:p>
         </w:tc>
@@ -3717,20 +3289,8 @@
             </w:tcMar>
           </w:tcPr>
           <w:p>
-            <w:pPr>
-              <w:rPr/>
-            </w:pPr>
-            <w:r>
-              <w:rPr>
-                <w:rFonts w:ascii="Calibri" w:cs="Calibri" w:eastAsia="Calibri" w:hAnsi="Calibri"/>
-                <w:rtl w:val="0"/>
-              </w:rPr>
-              <w:t xml:space="preserve">Event Management Service, Database</w:t>
-            </w:r>
-            <w:r>
-              <w:rPr>
-                <w:rtl w:val="0"/>
-              </w:rPr>
+            <w:r>
+              <w:t>Planned only — named service is not implemented in current baseline</w:t>
             </w:r>
           </w:p>
         </w:tc>
@@ -3998,28 +3558,7 @@
         <w:rPr/>
       </w:pPr>
       <w:r>
-        <w:rPr>
-          <w:rFonts w:ascii="Calibri" w:cs="Calibri" w:eastAsia="Calibri" w:hAnsi="Calibri"/>
-          <w:b w:val="0"/>
-          <w:bCs w:val="0"/>
-          <w:i w:val="0"/>
-          <w:iCs w:val="0"/>
-          <w:smallCaps w:val="0"/>
-          <w:strike w:val="0"/>
-          <w:color w:val="000000"/>
-          <w:sz w:val="20"/>
-          <w:szCs w:val="20"/>
-          <w:u w:val="none"/>
-          <w:shd w:fill="auto" w:val="clear"/>
-          <w:vertAlign w:val="baseline"/>
-          <w:rtl w:val="0"/>
-        </w:rPr>
-        <w:t xml:space="preserve">All client-server and server-to-gateway traffic shall use TLS 1.2 or higher.</w:t>
-      </w:r>
-      <w:r>
-        <w:rPr>
-          <w:rtl w:val="0"/>
-        </w:rPr>
+        <w:t>Production requirement: deploy all client-server and provider traffic over TLS 1.2 or higher. The local development server uses HTTP and the repository has no production TLS configuration; this control is not verified by local tests.</w:t>
       </w:r>
     </w:p>
     <w:p>
@@ -4046,28 +3585,7 @@
         <w:rPr/>
       </w:pPr>
       <w:r>
-        <w:rPr>
-          <w:rFonts w:ascii="Calibri" w:cs="Calibri" w:eastAsia="Calibri" w:hAnsi="Calibri"/>
-          <w:b w:val="0"/>
-          <w:bCs w:val="0"/>
-          <w:i w:val="0"/>
-          <w:iCs w:val="0"/>
-          <w:smallCaps w:val="0"/>
-          <w:strike w:val="0"/>
-          <w:color w:val="000000"/>
-          <w:sz w:val="20"/>
-          <w:szCs w:val="20"/>
-          <w:u w:val="none"/>
-          <w:shd w:fill="auto" w:val="clear"/>
-          <w:vertAlign w:val="baseline"/>
-          <w:rtl w:val="0"/>
-        </w:rPr>
-        <w:t xml:space="preserve">Raw payment card data shall never be stored on EMS servers; all card handling shall occur through the payment gateway's PCI-DSS-compliant flow.</w:t>
-      </w:r>
-      <w:r>
-        <w:rPr>
-          <w:rtl w:val="0"/>
-        </w:rPr>
+        <w:t>Payment security requirement: if a payment gateway is added, raw card data must never be stored on EMS servers. There is no payment flow in the current code, so PCI/payment compliance is not assessed.</w:t>
       </w:r>
     </w:p>
     <w:p>
@@ -4094,28 +3612,7 @@
         <w:rPr/>
       </w:pPr>
       <w:r>
-        <w:rPr>
-          <w:rFonts w:ascii="Calibri" w:cs="Calibri" w:eastAsia="Calibri" w:hAnsi="Calibri"/>
-          <w:b w:val="0"/>
-          <w:bCs w:val="0"/>
-          <w:i w:val="0"/>
-          <w:iCs w:val="0"/>
-          <w:smallCaps w:val="0"/>
-          <w:strike w:val="0"/>
-          <w:color w:val="000000"/>
-          <w:sz w:val="20"/>
-          <w:szCs w:val="20"/>
-          <w:u w:val="none"/>
-          <w:shd w:fill="auto" w:val="clear"/>
-          <w:vertAlign w:val="baseline"/>
-          <w:rtl w:val="0"/>
-        </w:rPr>
-        <w:t xml:space="preserve">Every API endpoint shall enforce role-based access control (RBAC) server-side, independent of UI-level restrictions.</w:t>
-      </w:r>
-      <w:r>
-        <w:rPr>
-          <w:rtl w:val="0"/>
-        </w:rPr>
+        <w:t>Protected event-management endpoints enforce authentication, role checks (ORGANIZER/ADMIN) and event ownership on the server. Public health/event-discovery/detail routes are intentionally public. There are no registration, payment or check-in routes in the current baseline.</w:t>
       </w:r>
     </w:p>
     <w:p>
@@ -4168,54 +3665,7 @@
         <w:rPr/>
       </w:pPr>
       <w:r>
-        <w:rPr>
-          <w:rFonts w:ascii="Calibri" w:cs="Calibri" w:eastAsia="Calibri" w:hAnsi="Calibri"/>
-          <w:b w:val="0"/>
-          <w:bCs w:val="0"/>
-          <w:i w:val="0"/>
-          <w:iCs w:val="0"/>
-          <w:smallCaps w:val="0"/>
-          <w:strike w:val="0"/>
-          <w:color w:val="000000"/>
-          <w:sz w:val="20"/>
-          <w:szCs w:val="20"/>
-          <w:u w:val="none"/>
-          <w:shd w:fill="auto" w:val="clear"/>
-          <w:vertAlign w:val="baseline"/>
-          <w:rtl w:val="0"/>
-        </w:rPr>
-        <w:t xml:space="preserve">Spoofing → mitigated by t</w:t>
-      </w:r>
-      <w:r>
-        <w:rPr>
-          <w:rFonts w:ascii="Calibri" w:cs="Calibri" w:eastAsia="Calibri" w:hAnsi="Calibri"/>
-          <w:rtl w:val="0"/>
-        </w:rPr>
-        <w:t xml:space="preserve">he </w:t>
-      </w:r>
-      <w:r>
-        <w:rPr>
-          <w:rFonts w:ascii="Calibri" w:cs="Calibri" w:eastAsia="Calibri" w:hAnsi="Calibri"/>
-          <w:b w:val="0"/>
-          <w:bCs w:val="0"/>
-          <w:i w:val="0"/>
-          <w:iCs w:val="0"/>
-          <w:smallCaps w:val="0"/>
-          <w:strike w:val="0"/>
-          <w:color w:val="000000"/>
-          <w:sz w:val="20"/>
-          <w:szCs w:val="20"/>
-          <w:u w:val="none"/>
-          <w:shd w:fill="auto" w:val="clear"/>
-          <w:vertAlign w:val="baseline"/>
-          <w:rtl w:val="0"/>
-        </w:rPr>
-        <w:t xml:space="preserve">JWT/session-based authentication and email verification at sign-up.</w:t>
-      </w:r>
-      <w:r>
-        <w:rPr>
-          <w:rtl w:val="0"/>
-        </w:rPr>
+        <w:t>Spoofing: JWT Bearer access tokens and email verification are implemented; the verification link is printed to the backend console in development rather than sent by email.</w:t>
       </w:r>
     </w:p>
     <w:p>
@@ -4242,28 +3692,7 @@
         <w:rPr/>
       </w:pPr>
       <w:r>
-        <w:rPr>
-          <w:rFonts w:ascii="Calibri" w:cs="Calibri" w:eastAsia="Calibri" w:hAnsi="Calibri"/>
-          <w:b w:val="0"/>
-          <w:bCs w:val="0"/>
-          <w:i w:val="0"/>
-          <w:iCs w:val="0"/>
-          <w:smallCaps w:val="0"/>
-          <w:strike w:val="0"/>
-          <w:color w:val="000000"/>
-          <w:sz w:val="20"/>
-          <w:szCs w:val="20"/>
-          <w:u w:val="none"/>
-          <w:shd w:fill="auto" w:val="clear"/>
-          <w:vertAlign w:val="baseline"/>
-          <w:rtl w:val="0"/>
-        </w:rPr>
-        <w:t xml:space="preserve">Tampering → mitigated by serverside validation of all event/registration state transitions; capacity checks never trust client input.</w:t>
-      </w:r>
-      <w:r>
-        <w:rPr>
-          <w:rtl w:val="0"/>
-        </w:rPr>
+        <w:t>Tampering: server-side event validation and owner checks are implemented. Registration/payment state-transition validation is future work because those flows do not exist.</w:t>
       </w:r>
     </w:p>
     <w:p>
@@ -4290,54 +3719,7 @@
         <w:rPr/>
       </w:pPr>
       <w:r>
-        <w:rPr>
-          <w:rFonts w:ascii="Calibri" w:cs="Calibri" w:eastAsia="Calibri" w:hAnsi="Calibri"/>
-          <w:b w:val="0"/>
-          <w:bCs w:val="0"/>
-          <w:i w:val="0"/>
-          <w:iCs w:val="0"/>
-          <w:smallCaps w:val="0"/>
-          <w:strike w:val="0"/>
-          <w:color w:val="000000"/>
-          <w:sz w:val="20"/>
-          <w:szCs w:val="20"/>
-          <w:u w:val="none"/>
-          <w:shd w:fill="auto" w:val="clear"/>
-          <w:vertAlign w:val="baseline"/>
-          <w:rtl w:val="0"/>
-        </w:rPr>
-        <w:t xml:space="preserve">Information Disclosure → mitigated by TLS in transit, hashed passwords whi</w:t>
-      </w:r>
-      <w:r>
-        <w:rPr>
-          <w:rFonts w:ascii="Calibri" w:cs="Calibri" w:eastAsia="Calibri" w:hAnsi="Calibri"/>
-          <w:rtl w:val="0"/>
-        </w:rPr>
-        <w:t xml:space="preserve">ch are </w:t>
-      </w:r>
-      <w:r>
-        <w:rPr>
-          <w:rFonts w:ascii="Calibri" w:cs="Calibri" w:eastAsia="Calibri" w:hAnsi="Calibri"/>
-          <w:b w:val="0"/>
-          <w:bCs w:val="0"/>
-          <w:i w:val="0"/>
-          <w:iCs w:val="0"/>
-          <w:smallCaps w:val="0"/>
-          <w:strike w:val="0"/>
-          <w:color w:val="000000"/>
-          <w:sz w:val="20"/>
-          <w:szCs w:val="20"/>
-          <w:u w:val="none"/>
-          <w:shd w:fill="auto" w:val="clear"/>
-          <w:vertAlign w:val="baseline"/>
-          <w:rtl w:val="0"/>
-        </w:rPr>
-        <w:t xml:space="preserve">at rest, and no raw payment data stored.</w:t>
-      </w:r>
-      <w:r>
-        <w:rPr>
-          <w:rtl w:val="0"/>
-        </w:rPr>
+        <w:t>Information disclosure: passwords are bcrypt-hashed and public user responses omit the hash. Local HTTP is used; TLS and payment-data controls must be verified in a deployed environment when payment is implemented.</w:t>
       </w:r>
     </w:p>
     <w:p>
@@ -4364,28 +3746,7 @@
         <w:rPr/>
       </w:pPr>
       <w:r>
-        <w:rPr>
-          <w:rFonts w:ascii="Calibri" w:cs="Calibri" w:eastAsia="Calibri" w:hAnsi="Calibri"/>
-          <w:b w:val="0"/>
-          <w:bCs w:val="0"/>
-          <w:i w:val="0"/>
-          <w:iCs w:val="0"/>
-          <w:smallCaps w:val="0"/>
-          <w:strike w:val="0"/>
-          <w:color w:val="000000"/>
-          <w:sz w:val="20"/>
-          <w:szCs w:val="20"/>
-          <w:u w:val="none"/>
-          <w:shd w:fill="auto" w:val="clear"/>
-          <w:vertAlign w:val="baseline"/>
-          <w:rtl w:val="0"/>
-        </w:rPr>
-        <w:t xml:space="preserve">Denial of Service → mitigated by rate limiting on authentication and registration endpoints.</w:t>
-      </w:r>
-      <w:r>
-        <w:rPr>
-          <w:rtl w:val="0"/>
-        </w:rPr>
+        <w:t>Denial of service: the login endpoint has a rate limiter (20 requests per 15 minutes per limiter key). No registration-endpoint rate limiter or production traffic controls are configured.</w:t>
       </w:r>
     </w:p>
     <w:p>
@@ -4412,54 +3773,7 @@
         <w:rPr/>
       </w:pPr>
       <w:r>
-        <w:rPr>
-          <w:rFonts w:ascii="Calibri" w:cs="Calibri" w:eastAsia="Calibri" w:hAnsi="Calibri"/>
-          <w:b w:val="0"/>
-          <w:bCs w:val="0"/>
-          <w:i w:val="0"/>
-          <w:iCs w:val="0"/>
-          <w:smallCaps w:val="0"/>
-          <w:strike w:val="0"/>
-          <w:color w:val="000000"/>
-          <w:sz w:val="20"/>
-          <w:szCs w:val="20"/>
-          <w:u w:val="none"/>
-          <w:shd w:fill="auto" w:val="clear"/>
-          <w:vertAlign w:val="baseline"/>
-          <w:rtl w:val="0"/>
-        </w:rPr>
-        <w:t xml:space="preserve">Elevation of Privilege → mitigated by RBAC enforced at the API layer for Organizer and Administrator</w:t>
-      </w:r>
-      <w:r>
-        <w:rPr>
-          <w:rFonts w:ascii="Calibri" w:cs="Calibri" w:eastAsia="Calibri" w:hAnsi="Calibri"/>
-          <w:rtl w:val="0"/>
-        </w:rPr>
-        <w:t xml:space="preserve"> </w:t>
-      </w:r>
-      <w:r>
-        <w:rPr>
-          <w:rFonts w:ascii="Calibri" w:cs="Calibri" w:eastAsia="Calibri" w:hAnsi="Calibri"/>
-          <w:b w:val="0"/>
-          <w:bCs w:val="0"/>
-          <w:i w:val="0"/>
-          <w:iCs w:val="0"/>
-          <w:smallCaps w:val="0"/>
-          <w:strike w:val="0"/>
-          <w:color w:val="000000"/>
-          <w:sz w:val="20"/>
-          <w:szCs w:val="20"/>
-          <w:u w:val="none"/>
-          <w:shd w:fill="auto" w:val="clear"/>
-          <w:vertAlign w:val="baseline"/>
-          <w:rtl w:val="0"/>
-        </w:rPr>
-        <w:t xml:space="preserve">only actions.</w:t>
-      </w:r>
-      <w:r>
-        <w:rPr>
-          <w:rtl w:val="0"/>
-        </w:rPr>
+        <w:t>Elevation of privilege: protected event routes use server-side role and ownership checks for Organizer/Admin operations. The UI alone is not the security boundary.</w:t>
       </w:r>
     </w:p>
     <w:p>
@@ -4529,16 +3843,7 @@
         <w:rPr/>
       </w:pPr>
       <w:r>
-        <w:rPr>
-          <w:rFonts w:ascii="Calibri" w:cs="Calibri" w:eastAsia="Calibri" w:hAnsi="Calibri"/>
-          <w:rtl w:val="0"/>
-        </w:rPr>
-        <w:t xml:space="preserve">The EMS is designed around the services introduced in Section 3, each exposing a narrow REST interface to the API server. Cross-service workflows like  registering for a paid event, or checking in an attendee which are coordinated by the API server calling the relevant services in sequence, as shown in the two flows below.</w:t>
-      </w:r>
-      <w:r>
-        <w:rPr>
-          <w:rtl w:val="0"/>
-        </w:rPr>
+        <w:t>The current API is a layered monolith rather than a multi-service deployment. The two sequences below document actual authentication and event-lifecycle interactions:</w:t>
       </w:r>
     </w:p>
     <w:p>
@@ -4571,16 +3876,7 @@
         <w:rPr/>
       </w:pPr>
       <w:r>
-        <w:rPr>
-          <w:rFonts w:ascii="Calibri" w:cs="Calibri" w:eastAsia="Calibri" w:hAnsi="Calibri"/>
-          <w:rtl w:val="0"/>
-        </w:rPr>
-        <w:t xml:space="preserve">Two representative flows are shown: (1) an attendee registering for and paying for an event, and (2) organizer checking in an attendee via QR code at the event.</w:t>
-      </w:r>
-      <w:r>
-        <w:rPr>
-          <w:rtl w:val="0"/>
-        </w:rPr>
+        <w:t>Two implemented flows are shown: (1) account registration, development email verification and JWT login, and (2) event creation, publishing and public event discovery. Registration/payment and QR check-in sequences from earlier target-state drafts have been removed because those APIs do not exist in this baseline.</w:t>
       </w:r>
     </w:p>
     <w:p>
@@ -4593,7 +3889,7 @@
         <w:rPr/>
         <w:drawing>
           <wp:inline distB="114300" distT="114300" distL="114300" distR="114300">
-            <wp:extent cx="5943600" cy="3962400"/>
+            <wp:extent cx="5760720" cy="4547936"/>
             <wp:effectExtent b="0" l="0" r="0" t="0"/>
             <wp:docPr id="1673150245" name="image2.png"/>
             <a:graphic>
@@ -4613,7 +3909,7 @@
                   <pic:spPr>
                     <a:xfrm>
                       <a:off x="0" y="0"/>
-                      <a:ext cx="5943600" cy="3962400"/>
+                      <a:ext cx="5760720" cy="4547936"/>
                     </a:xfrm>
                     <a:prstGeom prst="rect"/>
                     <a:ln/>
@@ -4638,20 +3934,7 @@
         <w:rPr/>
       </w:pPr>
       <w:r>
-        <w:rPr>
-          <w:rFonts w:ascii="Calibri" w:cs="Calibri" w:eastAsia="Calibri" w:hAnsi="Calibri"/>
-          <w:i w:val="1"/>
-          <w:iCs w:val="1"/>
-          <w:sz w:val="19"/>
-          <w:szCs w:val="19"/>
-          <w:rtl w:val="0"/>
-        </w:rPr>
-        <w:t xml:space="preserve">Figure 2 — Sequence diagram: Event registration and payment.</w:t>
-      </w:r>
-      <w:r>
-        <w:rPr>
-          <w:rtl w:val="0"/>
-        </w:rPr>
+        <w:t>Figure 2 — As-built sequence diagram: account registration, email verification and login.</w:t>
       </w:r>
     </w:p>
     <w:p>
@@ -4664,7 +3947,7 @@
         <w:rPr/>
         <w:drawing>
           <wp:inline distB="114300" distT="114300" distL="114300" distR="114300">
-            <wp:extent cx="5943600" cy="3962400"/>
+            <wp:extent cx="5760720" cy="4547936"/>
             <wp:effectExtent b="0" l="0" r="0" t="0"/>
             <wp:docPr id="1673150244" name="image3.png"/>
             <a:graphic>
@@ -4684,7 +3967,7 @@
                   <pic:spPr>
                     <a:xfrm>
                       <a:off x="0" y="0"/>
-                      <a:ext cx="5943600" cy="3962400"/>
+                      <a:ext cx="5760720" cy="4547936"/>
                     </a:xfrm>
                     <a:prstGeom prst="rect"/>
                     <a:ln/>
@@ -4708,20 +3991,7 @@
         <w:rPr/>
       </w:pPr>
       <w:r>
-        <w:rPr>
-          <w:rFonts w:ascii="Calibri" w:cs="Calibri" w:eastAsia="Calibri" w:hAnsi="Calibri"/>
-          <w:i w:val="1"/>
-          <w:iCs w:val="1"/>
-          <w:sz w:val="19"/>
-          <w:szCs w:val="19"/>
-          <w:rtl w:val="0"/>
-        </w:rPr>
-        <w:t xml:space="preserve">Figure 3 — Sequence diagram: QR-code attendee check-in.</w:t>
-      </w:r>
-      <w:r>
-        <w:rPr>
-          <w:rtl w:val="0"/>
-        </w:rPr>
+        <w:t>Figure 3 — As-built sequence diagram: event lifecycle and public discovery.</w:t>
       </w:r>
     </w:p>
     <w:p>
@@ -4754,16 +4024,7 @@
         <w:rPr/>
       </w:pPr>
       <w:r>
-        <w:rPr>
-          <w:rFonts w:ascii="Calibri" w:cs="Calibri" w:eastAsia="Calibri" w:hAnsi="Calibri"/>
-          <w:rtl w:val="0"/>
-        </w:rPr>
-        <w:t xml:space="preserve">Representative endpoint definitions forthe two core components (Registration &amp; Waitlist Service and QR Check-in Service):</w:t>
-      </w:r>
-      <w:r>
-        <w:rPr>
-          <w:rtl w:val="0"/>
-        </w:rPr>
+        <w:t>The implemented HTTP routes are listed below. Payload details and query parameters are documented in docs/API_REFERENCE.md. No registration or check-in endpoint is mounted in this baseline.</w:t>
       </w:r>
     </w:p>
     <w:p>
@@ -4775,100 +4036,144 @@
         </w:rPr>
       </w:pPr>
       <w:r>
+        <w:t>Implemented API endpoints (summary)</w:t>
+      </w:r>
+    </w:p>
+    <w:p>
+      <w:pPr>
+        <w:spacing w:after="40" w:lineRule="auto"/>
+        <w:rPr/>
+      </w:pPr>
+      <w:r>
+        <w:t>Health and discovery: GET /api/health; GET /api/events (published-event listing, search, filters and pagination); GET /api/events/:id (published event details).</w:t>
+      </w:r>
+    </w:p>
+    <w:p>
+      <w:pPr>
+        <w:spacing w:after="40" w:lineRule="auto"/>
+        <w:rPr/>
+      </w:pPr>
+      <w:r>
+        <w:t>Authentication (public except /me): POST /api/auth/register; GET /api/auth/verify/:token; POST /api/auth/login; GET /api/auth/me (Bearer JWT).</w:t>
+      </w:r>
+    </w:p>
+    <w:p>
+      <w:pPr>
+        <w:spacing w:after="40" w:lineRule="auto"/>
+        <w:rPr/>
+      </w:pPr>
+      <w:r>
+        <w:t>Event management (Bearer JWT; ORGANIZER/ADMIN): GET /api/events/manage/mine; POST /api/events; PUT /api/events/:id; POST /api/events/:id/publish; POST /api/events/:id/cancel.</w:t>
+      </w:r>
+    </w:p>
+    <w:p>
+      <w:pPr>
+        <w:spacing w:after="40" w:lineRule="auto"/>
+        <w:rPr/>
+      </w:pPr>
+      <w:r>
+        <w:t>Response shape: JSON; create-event returns 201 with { event }; listing returns { events, pagination }; details returns { event }. See docs/API_REFERENCE.md for query and body contracts.</w:t>
+      </w:r>
+    </w:p>
+    <w:p>
+      <w:pPr>
+        <w:spacing w:after="40" w:lineRule="auto"/>
+        <w:rPr/>
+      </w:pPr>
+      <w:r>
+        <w:t>Common errors: 400 validation, 401 UNAUTHENTICATED, 403 FORBIDDEN, 404 NOT_FOUND, 409 state conflict and 423 ACCOUNT_LOCKED on login. Error envelope: { error: { code, message } }.</w:t>
+      </w:r>
+    </w:p>
+    <w:p>
+      <w:pPr>
+        <w:spacing w:after="140" w:lineRule="auto"/>
+        <w:rPr/>
+      </w:pPr>
+      <w:r>
+        <w:rPr>
+          <w:rtl w:val="0"/>
+        </w:rPr>
+      </w:r>
+    </w:p>
+    <w:p>
+      <w:pPr>
+        <w:pStyle w:val="Heading3"/>
+        <w:spacing w:after="80" w:before="160" w:lineRule="auto"/>
+        <w:rPr>
+          <w:color w:val="000000"/>
+        </w:rPr>
+      </w:pPr>
+      <w:r>
+        <w:t>Future APIs — not implemented</w:t>
+      </w:r>
+    </w:p>
+    <w:p>
+      <w:pPr>
+        <w:spacing w:after="40" w:lineRule="auto"/>
+        <w:rPr/>
+      </w:pPr>
+      <w:r>
+        <w:t>No event registration, waitlist, payment/refund, email notification, QR-ticket/check-in, dashboard/export or feedback routes exist in this snapshot.</w:t>
+      </w:r>
+    </w:p>
+    <w:p>
+      <w:pPr>
+        <w:spacing w:after="40" w:lineRule="auto"/>
+        <w:rPr/>
+      </w:pPr>
+      <w:r>
+        <w:t>Do not document or call guessed paths for these features. Add route/controller/model tests when those modules are implemented.</w:t>
+      </w:r>
+    </w:p>
+    <w:p>
+      <w:pPr>
+        <w:spacing w:after="40" w:lineRule="auto"/>
+        <w:rPr/>
+      </w:pPr>
+      <w:r/>
+    </w:p>
+    <w:p>
+      <w:pPr>
+        <w:spacing w:after="40" w:lineRule="auto"/>
+        <w:rPr/>
+      </w:pPr>
+      <w:r/>
+    </w:p>
+    <w:p>
+      <w:pPr>
+        <w:spacing w:after="40" w:lineRule="auto"/>
+        <w:rPr/>
+      </w:pPr>
+      <w:r/>
+    </w:p>
+    <w:p>
+      <w:pPr>
+        <w:spacing w:after="140" w:lineRule="auto"/>
+        <w:rPr/>
+      </w:pPr>
+      <w:r>
+        <w:rPr>
+          <w:rtl w:val="0"/>
+        </w:rPr>
+      </w:r>
+    </w:p>
+    <w:p>
+      <w:pPr>
+        <w:pStyle w:val="Heading2"/>
+        <w:spacing w:after="100" w:before="220" w:lineRule="auto"/>
+        <w:rPr>
+          <w:color w:val="000000"/>
+        </w:rPr>
+      </w:pPr>
+      <w:r>
         <w:rPr>
           <w:rFonts w:ascii="Calibri" w:cs="Calibri" w:eastAsia="Calibri" w:hAnsi="Calibri"/>
           <w:b w:val="1"/>
           <w:bCs w:val="1"/>
-          <w:i w:val="1"/>
-          <w:iCs w:val="1"/>
-          <w:color w:val="000000"/>
-          <w:rtl w:val="0"/>
-        </w:rPr>
-        <w:t xml:space="preserve">Register for an Event</w:t>
-      </w:r>
-      <w:r>
-        <w:rPr>
-          <w:rtl w:val="0"/>
-        </w:rPr>
-      </w:r>
-    </w:p>
-    <w:p>
-      <w:pPr>
-        <w:spacing w:after="40" w:lineRule="auto"/>
-        <w:rPr/>
-      </w:pPr>
-      <w:r>
-        <w:rPr>
-          <w:rFonts w:ascii="Consolas" w:cs="Consolas" w:eastAsia="Consolas" w:hAnsi="Consolas"/>
-          <w:rtl w:val="0"/>
-        </w:rPr>
-        <w:t xml:space="preserve">Method: POST</w:t>
-      </w:r>
-      <w:r>
-        <w:rPr>
-          <w:rtl w:val="0"/>
-        </w:rPr>
-      </w:r>
-    </w:p>
-    <w:p>
-      <w:pPr>
-        <w:spacing w:after="40" w:lineRule="auto"/>
-        <w:rPr/>
-      </w:pPr>
-      <w:r>
-        <w:rPr>
-          <w:rFonts w:ascii="Consolas" w:cs="Consolas" w:eastAsia="Consolas" w:hAnsi="Consolas"/>
-          <w:rtl w:val="0"/>
-        </w:rPr>
-        <w:t xml:space="preserve">Endpoint: /api/events/{eventId}/register</w:t>
-      </w:r>
-      <w:r>
-        <w:rPr>
-          <w:rtl w:val="0"/>
-        </w:rPr>
-      </w:r>
-    </w:p>
-    <w:p>
-      <w:pPr>
-        <w:spacing w:after="40" w:lineRule="auto"/>
-        <w:rPr/>
-      </w:pPr>
-      <w:r>
-        <w:rPr>
-          <w:rtl w:val="0"/>
-        </w:rPr>
-        <w:t xml:space="preserve">Request: { } — attendee identity derived from the authenticated session/JWT.</w:t>
-      </w:r>
-    </w:p>
-    <w:p>
-      <w:pPr>
-        <w:spacing w:after="40" w:lineRule="auto"/>
-        <w:rPr/>
-      </w:pPr>
-      <w:r>
-        <w:rPr>
-          <w:rFonts w:ascii="Consolas" w:cs="Consolas" w:eastAsia="Consolas" w:hAnsi="Consolas"/>
-          <w:rtl w:val="0"/>
-        </w:rPr>
-        <w:t xml:space="preserve">Response: { status: 'confirmed' | 'waitlisted', registrationId, qrTicketCode }</w:t>
-      </w:r>
-      <w:r>
-        <w:rPr>
-          <w:rtl w:val="0"/>
-        </w:rPr>
-      </w:r>
-    </w:p>
-    <w:p>
-      <w:pPr>
-        <w:spacing w:after="40" w:lineRule="auto"/>
-        <w:rPr/>
-      </w:pPr>
-      <w:r>
-        <w:rPr>
-          <w:rFonts w:ascii="Consolas" w:cs="Consolas" w:eastAsia="Consolas" w:hAnsi="Consolas"/>
-          <w:rtl w:val="0"/>
-        </w:rPr>
-        <w:t xml:space="preserve">Errors: 401 Unauthenticated, 404 Event not found, 409 Registration already exists</w:t>
+          <w:color w:val="000000"/>
+          <w:rtl w:val="0"/>
+        </w:rPr>
+        <w:t xml:space="preserve">4.4 Error Handling, Logging &amp; Monitoring</w:t>
       </w:r>
       <w:r>
         <w:rPr>
@@ -4882,15 +4187,13 @@
         <w:rPr/>
       </w:pPr>
       <w:r>
-        <w:rPr>
-          <w:rtl w:val="0"/>
-        </w:rPr>
-      </w:r>
-    </w:p>
-    <w:p>
-      <w:pPr>
-        <w:pStyle w:val="Heading3"/>
-        <w:spacing w:after="80" w:before="160" w:lineRule="auto"/>
+        <w:t>All API errors use a standardized JSON envelope { error: { code, message } }. The generic error handler avoids returning internal details for server errors and avoids logging request passwords/tokens. The application does not currently implement production monitoring/alerting or metrics for payment, registration, notification or QR workflows.</w:t>
+      </w:r>
+    </w:p>
+    <w:p>
+      <w:pPr>
+        <w:pStyle w:val="Heading2"/>
+        <w:spacing w:after="100" w:before="220" w:lineRule="auto"/>
         <w:rPr>
           <w:color w:val="000000"/>
         </w:rPr>
@@ -4900,102 +4203,10 @@
           <w:rFonts w:ascii="Calibri" w:cs="Calibri" w:eastAsia="Calibri" w:hAnsi="Calibri"/>
           <w:b w:val="1"/>
           <w:bCs w:val="1"/>
-          <w:i w:val="1"/>
-          <w:iCs w:val="1"/>
-          <w:color w:val="000000"/>
-          <w:rtl w:val="0"/>
-        </w:rPr>
-        <w:t xml:space="preserve">Check In an Attendee</w:t>
-      </w:r>
-      <w:r>
-        <w:rPr>
-          <w:rtl w:val="0"/>
-        </w:rPr>
-      </w:r>
-    </w:p>
-    <w:p>
-      <w:pPr>
-        <w:spacing w:after="40" w:lineRule="auto"/>
-        <w:rPr/>
-      </w:pPr>
-      <w:r>
-        <w:rPr>
-          <w:rFonts w:ascii="Consolas" w:cs="Consolas" w:eastAsia="Consolas" w:hAnsi="Consolas"/>
-          <w:rtl w:val="0"/>
-        </w:rPr>
-        <w:t xml:space="preserve">Method: POST</w:t>
-      </w:r>
-      <w:r>
-        <w:rPr>
-          <w:rtl w:val="0"/>
-        </w:rPr>
-      </w:r>
-    </w:p>
-    <w:p>
-      <w:pPr>
-        <w:spacing w:after="40" w:lineRule="auto"/>
-        <w:rPr/>
-      </w:pPr>
-      <w:r>
-        <w:rPr>
-          <w:rFonts w:ascii="Consolas" w:cs="Consolas" w:eastAsia="Consolas" w:hAnsi="Consolas"/>
-          <w:rtl w:val="0"/>
-        </w:rPr>
-        <w:t xml:space="preserve">Endpoint: /api/checkin</w:t>
-      </w:r>
-      <w:r>
-        <w:rPr>
-          <w:rtl w:val="0"/>
-        </w:rPr>
-      </w:r>
-    </w:p>
-    <w:p>
-      <w:pPr>
-        <w:spacing w:after="40" w:lineRule="auto"/>
-        <w:rPr/>
-      </w:pPr>
-      <w:r>
-        <w:rPr>
-          <w:rFonts w:ascii="Consolas" w:cs="Consolas" w:eastAsia="Consolas" w:hAnsi="Consolas"/>
-          <w:rtl w:val="0"/>
-        </w:rPr>
-        <w:t xml:space="preserve">Request: { qrTicketCode, eventId }</w:t>
-      </w:r>
-      <w:r>
-        <w:rPr>
-          <w:rtl w:val="0"/>
-        </w:rPr>
-      </w:r>
-    </w:p>
-    <w:p>
-      <w:pPr>
-        <w:spacing w:after="40" w:lineRule="auto"/>
-        <w:rPr/>
-      </w:pPr>
-      <w:r>
-        <w:rPr>
-          <w:rFonts w:ascii="Consolas" w:cs="Consolas" w:eastAsia="Consolas" w:hAnsi="Consolas"/>
-          <w:rtl w:val="0"/>
-        </w:rPr>
-        <w:t xml:space="preserve">Response: { status: 'checked_in', attendeeName, checkedInAt }</w:t>
-      </w:r>
-      <w:r>
-        <w:rPr>
-          <w:rtl w:val="0"/>
-        </w:rPr>
-      </w:r>
-    </w:p>
-    <w:p>
-      <w:pPr>
-        <w:spacing w:after="40" w:lineRule="auto"/>
-        <w:rPr/>
-      </w:pPr>
-      <w:r>
-        <w:rPr>
-          <w:rFonts w:ascii="Consolas" w:cs="Consolas" w:eastAsia="Consolas" w:hAnsi="Consolas"/>
-          <w:rtl w:val="0"/>
-        </w:rPr>
-        <w:t xml:space="preserve">Errors: 400 Invalid QR code, 403 Not authorized to check in for this event, 409 Ticket already used</w:t>
+          <w:color w:val="000000"/>
+          <w:rtl w:val="0"/>
+        </w:rPr>
+        <w:t xml:space="preserve">4.5 UX Design</w:t>
       </w:r>
       <w:r>
         <w:rPr>
@@ -5009,93 +4220,7 @@
         <w:rPr/>
       </w:pPr>
       <w:r>
-        <w:rPr>
-          <w:rtl w:val="0"/>
-        </w:rPr>
-      </w:r>
-    </w:p>
-    <w:p>
-      <w:pPr>
-        <w:pStyle w:val="Heading2"/>
-        <w:spacing w:after="100" w:before="220" w:lineRule="auto"/>
-        <w:rPr>
-          <w:color w:val="000000"/>
-        </w:rPr>
-      </w:pPr>
-      <w:r>
-        <w:rPr>
-          <w:rFonts w:ascii="Calibri" w:cs="Calibri" w:eastAsia="Calibri" w:hAnsi="Calibri"/>
-          <w:b w:val="1"/>
-          <w:bCs w:val="1"/>
-          <w:color w:val="000000"/>
-          <w:rtl w:val="0"/>
-        </w:rPr>
-        <w:t xml:space="preserve">4.4 Error Handling, Logging &amp; Monitoring</w:t>
-      </w:r>
-      <w:r>
-        <w:rPr>
-          <w:rtl w:val="0"/>
-        </w:rPr>
-      </w:r>
-    </w:p>
-    <w:p>
-      <w:pPr>
-        <w:spacing w:after="140" w:lineRule="auto"/>
-        <w:rPr/>
-      </w:pPr>
-      <w:r>
-        <w:rPr>
-          <w:rFonts w:ascii="Calibri" w:cs="Calibri" w:eastAsia="Calibri" w:hAnsi="Calibri"/>
-          <w:rtl w:val="0"/>
-        </w:rPr>
-        <w:t xml:space="preserve">All API errors return a standardized JSON envelope: { error: { code, message } }, with no sensitive data (passwords, raw card numbers, full QR codes) ever included in logs. Monitoring the  tracks: registration failure rate, payment failure rate, average API response time, and QR check-in duplicate-scan rate, with alerting thresholds to be defined during implementation.</w:t>
-      </w:r>
-      <w:r>
-        <w:rPr>
-          <w:rtl w:val="0"/>
-        </w:rPr>
-      </w:r>
-    </w:p>
-    <w:p>
-      <w:pPr>
-        <w:pStyle w:val="Heading2"/>
-        <w:spacing w:after="100" w:before="220" w:lineRule="auto"/>
-        <w:rPr>
-          <w:color w:val="000000"/>
-        </w:rPr>
-      </w:pPr>
-      <w:r>
-        <w:rPr>
-          <w:rFonts w:ascii="Calibri" w:cs="Calibri" w:eastAsia="Calibri" w:hAnsi="Calibri"/>
-          <w:b w:val="1"/>
-          <w:bCs w:val="1"/>
-          <w:color w:val="000000"/>
-          <w:rtl w:val="0"/>
-        </w:rPr>
-        <w:t xml:space="preserve">4.5 UX Design</w:t>
-      </w:r>
-      <w:r>
-        <w:rPr>
-          <w:rtl w:val="0"/>
-        </w:rPr>
-      </w:r>
-    </w:p>
-    <w:p>
-      <w:pPr>
-        <w:spacing w:after="140" w:lineRule="auto"/>
-        <w:rPr/>
-      </w:pPr>
-      <w:r>
-        <w:rPr>
-          <w:rFonts w:ascii="Calibri" w:cs="Calibri" w:eastAsia="Calibri" w:hAnsi="Calibri"/>
-          <w:rtl w:val="0"/>
-        </w:rPr>
-        <w:t xml:space="preserve">The Organizer console emphasizes a short path from 'Create Event' to  published listing (target under 5 minutes per the SRS usability requirement). The Attendee-facing pages prioritize fast event discovery (search or filter above the fold) and a minimal friction checkout. The check-in screen is optimized for staff member scanning in rapid succession, with a clear large-text success/failure indicator per scan.</w:t>
-      </w:r>
-      <w:r>
-        <w:rPr>
-          <w:rtl w:val="0"/>
-        </w:rPr>
+        <w:t>The current UI supports account access, public event search/details and the Organizer event create/edit/manage flow. Registration checkout, attendee ticket/check-in and admin reporting screens do not exist in this baseline.</w:t>
       </w:r>
     </w:p>
     <w:p>
@@ -5146,23 +4271,7 @@
         <w:rPr/>
       </w:pPr>
       <w:r>
-        <w:rPr>
-          <w:rFonts w:ascii="Times New Roman" w:cs="Times New Roman" w:eastAsia="Times New Roman" w:hAnsi="Times New Roman"/>
-          <w:b w:val="0"/>
-          <w:bCs w:val="0"/>
-          <w:i w:val="0"/>
-          <w:iCs w:val="0"/>
-          <w:smallCaps w:val="0"/>
-          <w:strike w:val="0"/>
-          <w:color w:val="000000"/>
-          <w:sz w:val="20"/>
-          <w:szCs w:val="20"/>
-          <w:u w:val="none"/>
-          <w:shd w:fill="auto" w:val="clear"/>
-          <w:vertAlign w:val="baseline"/>
-          <w:rtl w:val="0"/>
-        </w:rPr>
-        <w:t xml:space="preserve">Confirm specific payment gateway and notification provider and finalize their API contracts before implementation.</w:t>
+        <w:t>Implement and test the registration model/routes before measuring concurrent booking, waitlist behavior or no-overbooking guarantees.</w:t>
       </w:r>
     </w:p>
     <w:p>
@@ -5376,6 +4485,328 @@
         <w:rPr>
           <w:rtl w:val="0"/>
         </w:rPr>
+      </w:r>
+    </w:p>
+    <w:p>
+      <w:r>
+        <w:br w:type="page"/>
+      </w:r>
+    </w:p>
+    <w:p>
+      <w:pPr>
+        <w:pStyle w:val="Heading1"/>
+      </w:pPr>
+      <w:r>
+        <w:t>Appendix A: As-built baseline and deferred components</w:t>
+      </w:r>
+    </w:p>
+    <w:p>
+      <w:r>
+        <w:t>This appendix is the implementation-status companion to the component and sequence diagrams in Sections 3 and 4. “Planned” means the current repository has no running service/route for the feature.</w:t>
+      </w:r>
+    </w:p>
+    <w:tbl>
+      <w:tblPr>
+        <w:tblW w:type="auto" w:w="0"/>
+        <w:tblLook w:firstColumn="1" w:firstRow="1" w:lastColumn="0" w:lastRow="0" w:noHBand="0" w:noVBand="1" w:val="04A0"/>
+      </w:tblPr>
+      <w:tblGrid>
+        <w:gridCol w:w="3120"/>
+        <w:gridCol w:w="3120"/>
+        <w:gridCol w:w="3120"/>
+      </w:tblGrid>
+      <w:tr>
+        <w:tc>
+          <w:tcPr>
+            <w:tcW w:type="dxa" w:w="3120"/>
+          </w:tcPr>
+          <w:p>
+            <w:r>
+              <w:t>Area / requirement</w:t>
+            </w:r>
+          </w:p>
+        </w:tc>
+        <w:tc>
+          <w:tcPr>
+            <w:tcW w:type="dxa" w:w="3120"/>
+          </w:tcPr>
+          <w:p>
+            <w:r>
+              <w:t>Status in current code baseline</w:t>
+            </w:r>
+          </w:p>
+        </w:tc>
+        <w:tc>
+          <w:tcPr>
+            <w:tcW w:type="dxa" w:w="3120"/>
+          </w:tcPr>
+          <w:p>
+            <w:r>
+              <w:t>Implementation evidence / limitation</w:t>
+            </w:r>
+          </w:p>
+        </w:tc>
+      </w:tr>
+      <w:tr>
+        <w:tc>
+          <w:tcPr>
+            <w:tcW w:type="dxa" w:w="3120"/>
+          </w:tcPr>
+          <w:p>
+            <w:r>
+              <w:t>Frontend</w:t>
+            </w:r>
+          </w:p>
+        </w:tc>
+        <w:tc>
+          <w:tcPr>
+            <w:tcW w:type="dxa" w:w="3120"/>
+          </w:tcPr>
+          <w:p>
+            <w:r>
+              <w:t>Implemented</w:t>
+            </w:r>
+          </w:p>
+        </w:tc>
+        <w:tc>
+          <w:tcPr>
+            <w:tcW w:type="dxa" w:w="3120"/>
+          </w:tcPr>
+          <w:p>
+            <w:r>
+              <w:t>React 18, Vite, React Router, Axios API client; account, event discovery/details and organizer event-management pages.</w:t>
+            </w:r>
+          </w:p>
+        </w:tc>
+      </w:tr>
+      <w:tr>
+        <w:tc>
+          <w:tcPr>
+            <w:tcW w:type="dxa" w:w="3120"/>
+          </w:tcPr>
+          <w:p>
+            <w:r>
+              <w:t>Backend</w:t>
+            </w:r>
+          </w:p>
+        </w:tc>
+        <w:tc>
+          <w:tcPr>
+            <w:tcW w:type="dxa" w:w="3120"/>
+          </w:tcPr>
+          <w:p>
+            <w:r>
+              <w:t>Implemented</w:t>
+            </w:r>
+          </w:p>
+        </w:tc>
+        <w:tc>
+          <w:tcPr>
+            <w:tcW w:type="dxa" w:w="3120"/>
+          </w:tcPr>
+          <w:p>
+            <w:r>
+              <w:t>Node.js/Express monolith with auth/event routes and controllers, JWT authentication, role authorization and structured error handler.</w:t>
+            </w:r>
+          </w:p>
+        </w:tc>
+      </w:tr>
+      <w:tr>
+        <w:tc>
+          <w:tcPr>
+            <w:tcW w:type="dxa" w:w="3120"/>
+          </w:tcPr>
+          <w:p>
+            <w:r>
+              <w:t>Data store</w:t>
+            </w:r>
+          </w:p>
+        </w:tc>
+        <w:tc>
+          <w:tcPr>
+            <w:tcW w:type="dxa" w:w="3120"/>
+          </w:tcPr>
+          <w:p>
+            <w:r>
+              <w:t>Implemented for current scope</w:t>
+            </w:r>
+          </w:p>
+        </w:tc>
+        <w:tc>
+          <w:tcPr>
+            <w:tcW w:type="dxa" w:w="3120"/>
+          </w:tcPr>
+          <w:p>
+            <w:r>
+              <w:t>SQLite via Sequelize; only User and Event models are registered. User has many Events through organizerId.</w:t>
+            </w:r>
+          </w:p>
+        </w:tc>
+      </w:tr>
+      <w:tr>
+        <w:tc>
+          <w:tcPr>
+            <w:tcW w:type="dxa" w:w="3120"/>
+          </w:tcPr>
+          <w:p>
+            <w:r>
+              <w:t>Email verification</w:t>
+            </w:r>
+          </w:p>
+        </w:tc>
+        <w:tc>
+          <w:tcPr>
+            <w:tcW w:type="dxa" w:w="3120"/>
+          </w:tcPr>
+          <w:p>
+            <w:r>
+              <w:t>Development stub</w:t>
+            </w:r>
+          </w:p>
+        </w:tc>
+        <w:tc>
+          <w:tcPr>
+            <w:tcW w:type="dxa" w:w="3120"/>
+          </w:tcPr>
+          <w:p>
+            <w:r>
+              <w:t>Signed token verification exists; link printed to backend console. No outbound email integration.</w:t>
+            </w:r>
+          </w:p>
+        </w:tc>
+      </w:tr>
+      <w:tr>
+        <w:tc>
+          <w:tcPr>
+            <w:tcW w:type="dxa" w:w="3120"/>
+          </w:tcPr>
+          <w:p>
+            <w:r>
+              <w:t>Registration and waitlist</w:t>
+            </w:r>
+          </w:p>
+        </w:tc>
+        <w:tc>
+          <w:tcPr>
+            <w:tcW w:type="dxa" w:w="3120"/>
+          </w:tcPr>
+          <w:p>
+            <w:r>
+              <w:t>Planned / absent</w:t>
+            </w:r>
+          </w:p>
+        </w:tc>
+        <w:tc>
+          <w:tcPr>
+            <w:tcW w:type="dxa" w:w="3120"/>
+          </w:tcPr>
+          <w:p>
+            <w:r>
+              <w:t>No Registration model or API routes.</w:t>
+            </w:r>
+          </w:p>
+        </w:tc>
+      </w:tr>
+      <w:tr>
+        <w:tc>
+          <w:tcPr>
+            <w:tcW w:type="dxa" w:w="3120"/>
+          </w:tcPr>
+          <w:p>
+            <w:r>
+              <w:t>Payments and refunds</w:t>
+            </w:r>
+          </w:p>
+        </w:tc>
+        <w:tc>
+          <w:tcPr>
+            <w:tcW w:type="dxa" w:w="3120"/>
+          </w:tcPr>
+          <w:p>
+            <w:r>
+              <w:t>Planned / absent</w:t>
+            </w:r>
+          </w:p>
+        </w:tc>
+        <w:tc>
+          <w:tcPr>
+            <w:tcW w:type="dxa" w:w="3120"/>
+          </w:tcPr>
+          <w:p>
+            <w:r>
+              <w:t>No payment model or gateway integration.</w:t>
+            </w:r>
+          </w:p>
+        </w:tc>
+      </w:tr>
+      <w:tr>
+        <w:tc>
+          <w:tcPr>
+            <w:tcW w:type="dxa" w:w="3120"/>
+          </w:tcPr>
+          <w:p>
+            <w:r>
+              <w:t>Notifications, QR/check-in, reporting, feedback</w:t>
+            </w:r>
+          </w:p>
+        </w:tc>
+        <w:tc>
+          <w:tcPr>
+            <w:tcW w:type="dxa" w:w="3120"/>
+          </w:tcPr>
+          <w:p>
+            <w:r>
+              <w:t>Planned / absent</w:t>
+            </w:r>
+          </w:p>
+        </w:tc>
+        <w:tc>
+          <w:tcPr>
+            <w:tcW w:type="dxa" w:w="3120"/>
+          </w:tcPr>
+          <w:p>
+            <w:r>
+              <w:t>No routes, models or completed UI for these modules.</w:t>
+            </w:r>
+          </w:p>
+        </w:tc>
+      </w:tr>
+      <w:tr>
+        <w:tc>
+          <w:tcPr>
+            <w:tcW w:type="dxa" w:w="3120"/>
+          </w:tcPr>
+          <w:p>
+            <w:r>
+              <w:t>Production security/scale</w:t>
+            </w:r>
+          </w:p>
+        </w:tc>
+        <w:tc>
+          <w:tcPr>
+            <w:tcW w:type="dxa" w:w="3120"/>
+          </w:tcPr>
+          <w:p>
+            <w:r>
+              <w:t>Not verified</w:t>
+            </w:r>
+          </w:p>
+        </w:tc>
+        <w:tc>
+          <w:tcPr>
+            <w:tcW w:type="dxa" w:w="3120"/>
+          </w:tcPr>
+          <w:p>
+            <w:r>
+              <w:t>Local server uses HTTP and SQLite; production TLS, shared database, availability, and scale testing remain future deployment tasks.</w:t>
+            </w:r>
+          </w:p>
+        </w:tc>
+      </w:tr>
+    </w:tbl>
+    <w:p>
+      <w:r>
+        <w:t>Evidence references: docs/IMPLEMENTATION_BASELINE.md; docs/API_REFERENCE.md; docs/TESTING_AND_RESULTS.md</w:t>
       </w:r>
     </w:p>
     <w:sectPr>

</xml_diff>